<commit_message>
up to dat epoplar paper and analysis (writin the draft now)
</commit_message>
<xml_diff>
--- a/decisions about upscaling.docx
+++ b/decisions about upscaling.docx
@@ -8,7 +8,6 @@
         <w:rPr>
           <w:rFonts w:ascii="Times New Roman" w:eastAsia="Times New Roman" w:hAnsi="Times New Roman" w:cs="Times New Roman"/>
           <w:kern w:val="0"/>
-          <w:lang/>
           <w14:ligatures w14:val="none"/>
         </w:rPr>
       </w:pPr>
@@ -16,7 +15,6 @@
         <w:rPr>
           <w:rFonts w:ascii="Times New Roman" w:eastAsia="Times New Roman" w:hAnsi="Symbol" w:cs="Times New Roman"/>
           <w:kern w:val="0"/>
-          <w:lang/>
           <w14:ligatures w14:val="none"/>
         </w:rPr>
         <w:t></w:t>
@@ -25,7 +23,6 @@
         <w:rPr>
           <w:rFonts w:ascii="Times New Roman" w:eastAsia="Times New Roman" w:hAnsi="Times New Roman" w:cs="Times New Roman"/>
           <w:kern w:val="0"/>
-          <w:lang/>
           <w14:ligatures w14:val="none"/>
         </w:rPr>
         <w:t xml:space="preserve">  </w:t>
@@ -36,7 +33,6 @@
           <w:b/>
           <w:bCs/>
           <w:kern w:val="0"/>
-          <w:lang/>
           <w14:ligatures w14:val="none"/>
         </w:rPr>
         <w:t>Country and eligible agricultural area</w:t>
@@ -52,7 +48,6 @@
         <w:rPr>
           <w:rFonts w:ascii="Times New Roman" w:eastAsia="Times New Roman" w:hAnsi="Times New Roman" w:cs="Times New Roman"/>
           <w:kern w:val="0"/>
-          <w:lang/>
           <w14:ligatures w14:val="none"/>
         </w:rPr>
       </w:pPr>
@@ -69,10 +64,28 @@
         <w:rPr>
           <w:rFonts w:ascii="Times New Roman" w:eastAsia="Times New Roman" w:hAnsi="Times New Roman" w:cs="Times New Roman"/>
           <w:kern w:val="0"/>
-          <w:lang/>
           <w14:ligatures w14:val="none"/>
         </w:rPr>
         <w:t>?</w:t>
+      </w:r>
+    </w:p>
+    <w:p>
+      <w:pPr>
+        <w:spacing w:before="100" w:beforeAutospacing="1" w:after="100" w:afterAutospacing="1" w:line="240" w:lineRule="auto"/>
+        <w:rPr>
+          <w:rFonts w:ascii="Times New Roman" w:eastAsia="Times New Roman" w:hAnsi="Times New Roman" w:cs="Times New Roman"/>
+          <w:kern w:val="0"/>
+          <w14:ligatures w14:val="none"/>
+        </w:rPr>
+      </w:pPr>
+      <w:r>
+        <w:rPr>
+          <w:rFonts w:ascii="Times New Roman" w:eastAsia="Times New Roman" w:hAnsi="Times New Roman" w:cs="Times New Roman"/>
+          <w:kern w:val="0"/>
+          <w:lang w:val="en-GB"/>
+          <w14:ligatures w14:val="none"/>
+        </w:rPr>
+        <w:t>UK</w:t>
       </w:r>
     </w:p>
     <w:p>
@@ -85,18 +98,95 @@
         <w:rPr>
           <w:rFonts w:ascii="Times New Roman" w:eastAsia="Times New Roman" w:hAnsi="Times New Roman" w:cs="Times New Roman"/>
           <w:kern w:val="0"/>
-          <w:lang/>
-          <w14:ligatures w14:val="none"/>
-        </w:rPr>
-      </w:pPr>
-      <w:r>
-        <w:rPr>
-          <w:rFonts w:ascii="Times New Roman" w:eastAsia="Times New Roman" w:hAnsi="Times New Roman" w:cs="Times New Roman"/>
-          <w:kern w:val="0"/>
-          <w:lang/>
+          <w14:ligatures w14:val="none"/>
+        </w:rPr>
+      </w:pPr>
+      <w:r>
+        <w:rPr>
+          <w:rFonts w:ascii="Times New Roman" w:eastAsia="Times New Roman" w:hAnsi="Times New Roman" w:cs="Times New Roman"/>
+          <w:kern w:val="0"/>
           <w14:ligatures w14:val="none"/>
         </w:rPr>
         <w:t>Arable land only, or other agricultural land?</w:t>
+      </w:r>
+    </w:p>
+    <w:p>
+      <w:pPr>
+        <w:spacing w:before="100" w:beforeAutospacing="1" w:after="100" w:afterAutospacing="1" w:line="240" w:lineRule="auto"/>
+        <w:rPr>
+          <w:rFonts w:ascii="Times New Roman" w:eastAsia="Times New Roman" w:hAnsi="Times New Roman" w:cs="Times New Roman"/>
+          <w:kern w:val="0"/>
+          <w:lang w:val="en-GB"/>
+          <w14:ligatures w14:val="none"/>
+        </w:rPr>
+      </w:pPr>
+      <w:r>
+        <w:rPr>
+          <w:rFonts w:ascii="Times New Roman" w:eastAsia="Times New Roman" w:hAnsi="Times New Roman" w:cs="Times New Roman"/>
+          <w:kern w:val="0"/>
+          <w:lang w:val="en-GB"/>
+          <w14:ligatures w14:val="none"/>
+        </w:rPr>
+        <w:t>From Climate Change Committee estimates: Trees on 10% of farmland by 2050. 14% of grassland area and 7% of cropland being used for planting trees by 2050. CCC did it from 2021 to 2050.</w:t>
+      </w:r>
+    </w:p>
+    <w:p>
+      <w:pPr>
+        <w:spacing w:before="100" w:beforeAutospacing="1" w:after="100" w:afterAutospacing="1" w:line="240" w:lineRule="auto"/>
+        <w:rPr>
+          <w:rFonts w:ascii="Times New Roman" w:eastAsia="Times New Roman" w:hAnsi="Times New Roman" w:cs="Times New Roman"/>
+          <w:kern w:val="0"/>
+          <w:lang w:val="en-GB"/>
+          <w14:ligatures w14:val="none"/>
+        </w:rPr>
+      </w:pPr>
+      <w:r>
+        <w:rPr>
+          <w:rFonts w:ascii="Times New Roman" w:eastAsia="Times New Roman" w:hAnsi="Times New Roman" w:cs="Times New Roman"/>
+          <w:kern w:val="0"/>
+          <w:lang w:val="en-GB"/>
+          <w14:ligatures w14:val="none"/>
+        </w:rPr>
+        <w:t xml:space="preserve">Cropland: They used poplar in 2 m wide rows, with spacing of 30 m between rows and 7 m between trees. </w:t>
+      </w:r>
+    </w:p>
+    <w:p>
+      <w:pPr>
+        <w:spacing w:before="100" w:beforeAutospacing="1" w:after="100" w:afterAutospacing="1" w:line="240" w:lineRule="auto"/>
+        <w:rPr>
+          <w:rFonts w:ascii="Times New Roman" w:eastAsia="Times New Roman" w:hAnsi="Times New Roman" w:cs="Times New Roman"/>
+          <w:kern w:val="0"/>
+          <w:lang w:val="en-GB"/>
+          <w14:ligatures w14:val="none"/>
+        </w:rPr>
+      </w:pPr>
+      <w:r>
+        <w:rPr>
+          <w:rFonts w:ascii="Times New Roman" w:eastAsia="Times New Roman" w:hAnsi="Times New Roman" w:cs="Times New Roman"/>
+          <w:kern w:val="0"/>
+          <w:lang w:val="en-GB"/>
+          <w14:ligatures w14:val="none"/>
+        </w:rPr>
+        <w:t>Grassland: They used broadleaf (we need to use poplar) at very high density.  We should use our density instead (166 trees/ha)</w:t>
+      </w:r>
+    </w:p>
+    <w:p>
+      <w:pPr>
+        <w:spacing w:before="100" w:beforeAutospacing="1" w:after="100" w:afterAutospacing="1" w:line="240" w:lineRule="auto"/>
+        <w:rPr>
+          <w:rFonts w:ascii="Times New Roman" w:eastAsia="Times New Roman" w:hAnsi="Times New Roman" w:cs="Times New Roman"/>
+          <w:kern w:val="0"/>
+          <w14:ligatures w14:val="none"/>
+        </w:rPr>
+      </w:pPr>
+      <w:r>
+        <w:rPr>
+          <w:rFonts w:ascii="Times New Roman" w:eastAsia="Times New Roman" w:hAnsi="Times New Roman" w:cs="Times New Roman"/>
+          <w:kern w:val="0"/>
+          <w:lang w:val="en-GB"/>
+          <w14:ligatures w14:val="none"/>
+        </w:rPr>
+        <w:t>3.8 million hectares by 2035 and 6.0 million by 2050. 6 million represents 35% of agricultural land</w:t>
       </w:r>
     </w:p>
     <w:p>
@@ -109,15 +199,13 @@
         <w:rPr>
           <w:rFonts w:ascii="Times New Roman" w:eastAsia="Times New Roman" w:hAnsi="Times New Roman" w:cs="Times New Roman"/>
           <w:kern w:val="0"/>
-          <w:lang/>
-          <w14:ligatures w14:val="none"/>
-        </w:rPr>
-      </w:pPr>
-      <w:r>
-        <w:rPr>
-          <w:rFonts w:ascii="Times New Roman" w:eastAsia="Times New Roman" w:hAnsi="Times New Roman" w:cs="Times New Roman"/>
-          <w:kern w:val="0"/>
-          <w:lang/>
+          <w14:ligatures w14:val="none"/>
+        </w:rPr>
+      </w:pPr>
+      <w:r>
+        <w:rPr>
+          <w:rFonts w:ascii="Times New Roman" w:eastAsia="Times New Roman" w:hAnsi="Times New Roman" w:cs="Times New Roman"/>
+          <w:kern w:val="0"/>
           <w14:ligatures w14:val="none"/>
         </w:rPr>
         <w:t>Which area dataset and reference year?</w:t>
@@ -129,7 +217,6 @@
         <w:rPr>
           <w:rFonts w:ascii="Times New Roman" w:eastAsia="Times New Roman" w:hAnsi="Times New Roman" w:cs="Times New Roman"/>
           <w:kern w:val="0"/>
-          <w:lang/>
           <w14:ligatures w14:val="none"/>
         </w:rPr>
       </w:pPr>
@@ -137,7 +224,6 @@
         <w:rPr>
           <w:rFonts w:ascii="Times New Roman" w:eastAsia="Times New Roman" w:hAnsi="Symbol" w:cs="Times New Roman"/>
           <w:kern w:val="0"/>
-          <w:lang/>
           <w14:ligatures w14:val="none"/>
         </w:rPr>
         <w:t></w:t>
@@ -146,7 +232,6 @@
         <w:rPr>
           <w:rFonts w:ascii="Times New Roman" w:eastAsia="Times New Roman" w:hAnsi="Times New Roman" w:cs="Times New Roman"/>
           <w:kern w:val="0"/>
-          <w:lang/>
           <w14:ligatures w14:val="none"/>
         </w:rPr>
         <w:t xml:space="preserve">  </w:t>
@@ -157,7 +242,6 @@
           <w:b/>
           <w:bCs/>
           <w:kern w:val="0"/>
-          <w:lang/>
           <w14:ligatures w14:val="none"/>
         </w:rPr>
         <w:t>Future land management</w:t>
@@ -173,15 +257,13 @@
         <w:rPr>
           <w:rFonts w:ascii="Times New Roman" w:eastAsia="Times New Roman" w:hAnsi="Times New Roman" w:cs="Times New Roman"/>
           <w:kern w:val="0"/>
-          <w:lang/>
-          <w14:ligatures w14:val="none"/>
-        </w:rPr>
-      </w:pPr>
-      <w:r>
-        <w:rPr>
-          <w:rFonts w:ascii="Times New Roman" w:eastAsia="Times New Roman" w:hAnsi="Times New Roman" w:cs="Times New Roman"/>
-          <w:kern w:val="0"/>
-          <w:lang/>
+          <w14:ligatures w14:val="none"/>
+        </w:rPr>
+      </w:pPr>
+      <w:r>
+        <w:rPr>
+          <w:rFonts w:ascii="Times New Roman" w:eastAsia="Times New Roman" w:hAnsi="Times New Roman" w:cs="Times New Roman"/>
+          <w:kern w:val="0"/>
           <w14:ligatures w14:val="none"/>
         </w:rPr>
         <w:t xml:space="preserve">Will continued cropping be included as a separate scenario? </w:t>
@@ -206,7 +288,6 @@
         <w:rPr>
           <w:rFonts w:ascii="Times New Roman" w:eastAsia="Times New Roman" w:hAnsi="Times New Roman" w:cs="Times New Roman"/>
           <w:kern w:val="0"/>
-          <w:lang/>
           <w14:ligatures w14:val="none"/>
         </w:rPr>
       </w:pPr>
@@ -226,7 +307,6 @@
         <w:rPr>
           <w:rFonts w:ascii="Times New Roman" w:eastAsia="Times New Roman" w:hAnsi="Times New Roman" w:cs="Times New Roman"/>
           <w:kern w:val="0"/>
-          <w:lang/>
           <w14:ligatures w14:val="none"/>
         </w:rPr>
       </w:pPr>
@@ -234,7 +314,6 @@
         <w:rPr>
           <w:rFonts w:ascii="Times New Roman" w:eastAsia="Times New Roman" w:hAnsi="Symbol" w:cs="Times New Roman"/>
           <w:kern w:val="0"/>
-          <w:lang/>
           <w14:ligatures w14:val="none"/>
         </w:rPr>
         <w:t></w:t>
@@ -243,7 +322,6 @@
         <w:rPr>
           <w:rFonts w:ascii="Times New Roman" w:eastAsia="Times New Roman" w:hAnsi="Times New Roman" w:cs="Times New Roman"/>
           <w:kern w:val="0"/>
-          <w:lang/>
           <w14:ligatures w14:val="none"/>
         </w:rPr>
         <w:t xml:space="preserve">  </w:t>
@@ -254,7 +332,6 @@
           <w:b/>
           <w:bCs/>
           <w:kern w:val="0"/>
-          <w:lang/>
           <w14:ligatures w14:val="none"/>
         </w:rPr>
         <w:t>Planting layout</w:t>
@@ -270,15 +347,13 @@
         <w:rPr>
           <w:rFonts w:ascii="Times New Roman" w:eastAsia="Times New Roman" w:hAnsi="Times New Roman" w:cs="Times New Roman"/>
           <w:kern w:val="0"/>
-          <w:lang/>
-          <w14:ligatures w14:val="none"/>
-        </w:rPr>
-      </w:pPr>
-      <w:r>
-        <w:rPr>
-          <w:rFonts w:ascii="Times New Roman" w:eastAsia="Times New Roman" w:hAnsi="Times New Roman" w:cs="Times New Roman"/>
-          <w:kern w:val="0"/>
-          <w:lang/>
+          <w14:ligatures w14:val="none"/>
+        </w:rPr>
+      </w:pPr>
+      <w:r>
+        <w:rPr>
+          <w:rFonts w:ascii="Times New Roman" w:eastAsia="Times New Roman" w:hAnsi="Times New Roman" w:cs="Times New Roman"/>
+          <w:kern w:val="0"/>
           <w14:ligatures w14:val="none"/>
         </w:rPr>
         <w:t>Tree-row strip width, alley width and spacing between trees within rows.</w:t>
@@ -294,15 +369,13 @@
         <w:rPr>
           <w:rFonts w:ascii="Times New Roman" w:eastAsia="Times New Roman" w:hAnsi="Times New Roman" w:cs="Times New Roman"/>
           <w:kern w:val="0"/>
-          <w:lang/>
-          <w14:ligatures w14:val="none"/>
-        </w:rPr>
-      </w:pPr>
-      <w:r>
-        <w:rPr>
-          <w:rFonts w:ascii="Times New Roman" w:eastAsia="Times New Roman" w:hAnsi="Times New Roman" w:cs="Times New Roman"/>
-          <w:kern w:val="0"/>
-          <w:lang/>
+          <w14:ligatures w14:val="none"/>
+        </w:rPr>
+      </w:pPr>
+      <w:r>
+        <w:rPr>
+          <w:rFonts w:ascii="Times New Roman" w:eastAsia="Times New Roman" w:hAnsi="Times New Roman" w:cs="Times New Roman"/>
+          <w:kern w:val="0"/>
           <w14:ligatures w14:val="none"/>
         </w:rPr>
         <w:t>Derive tree density and the tree-row/grassland area fractions consistently from that geometry.</w:t>
@@ -318,15 +391,13 @@
         <w:rPr>
           <w:rFonts w:ascii="Times New Roman" w:eastAsia="Times New Roman" w:hAnsi="Times New Roman" w:cs="Times New Roman"/>
           <w:kern w:val="0"/>
-          <w:lang/>
-          <w14:ligatures w14:val="none"/>
-        </w:rPr>
-      </w:pPr>
-      <w:r>
-        <w:rPr>
-          <w:rFonts w:ascii="Times New Roman" w:eastAsia="Times New Roman" w:hAnsi="Times New Roman" w:cs="Times New Roman"/>
-          <w:kern w:val="0"/>
-          <w:lang/>
+          <w14:ligatures w14:val="none"/>
+        </w:rPr>
+      </w:pPr>
+      <w:r>
+        <w:rPr>
+          <w:rFonts w:ascii="Times New Roman" w:eastAsia="Times New Roman" w:hAnsi="Times New Roman" w:cs="Times New Roman"/>
+          <w:kern w:val="0"/>
           <w14:ligatures w14:val="none"/>
         </w:rPr>
         <w:t>Decide how far density can differ from the experiment while assuming the same growth per tree.</w:t>
@@ -338,7 +409,6 @@
         <w:rPr>
           <w:rFonts w:ascii="Times New Roman" w:eastAsia="Times New Roman" w:hAnsi="Times New Roman" w:cs="Times New Roman"/>
           <w:kern w:val="0"/>
-          <w:lang/>
           <w14:ligatures w14:val="none"/>
         </w:rPr>
       </w:pPr>
@@ -346,7 +416,6 @@
         <w:rPr>
           <w:rFonts w:ascii="Times New Roman" w:eastAsia="Times New Roman" w:hAnsi="Symbol" w:cs="Times New Roman"/>
           <w:kern w:val="0"/>
-          <w:lang/>
           <w14:ligatures w14:val="none"/>
         </w:rPr>
         <w:t></w:t>
@@ -355,7 +424,6 @@
         <w:rPr>
           <w:rFonts w:ascii="Times New Roman" w:eastAsia="Times New Roman" w:hAnsi="Times New Roman" w:cs="Times New Roman"/>
           <w:kern w:val="0"/>
-          <w:lang/>
           <w14:ligatures w14:val="none"/>
         </w:rPr>
         <w:t xml:space="preserve">  </w:t>
@@ -366,7 +434,6 @@
           <w:b/>
           <w:bCs/>
           <w:kern w:val="0"/>
-          <w:lang/>
           <w14:ligatures w14:val="none"/>
         </w:rPr>
         <w:t>Planting ambition and annual planting schedule</w:t>
@@ -382,15 +449,13 @@
         <w:rPr>
           <w:rFonts w:ascii="Times New Roman" w:eastAsia="Times New Roman" w:hAnsi="Times New Roman" w:cs="Times New Roman"/>
           <w:kern w:val="0"/>
-          <w:lang/>
-          <w14:ligatures w14:val="none"/>
-        </w:rPr>
-      </w:pPr>
-      <w:r>
-        <w:rPr>
-          <w:rFonts w:ascii="Times New Roman" w:eastAsia="Times New Roman" w:hAnsi="Times New Roman" w:cs="Times New Roman"/>
-          <w:kern w:val="0"/>
-          <w:lang/>
+          <w14:ligatures w14:val="none"/>
+        </w:rPr>
+      </w:pPr>
+      <w:r>
+        <w:rPr>
+          <w:rFonts w:ascii="Times New Roman" w:eastAsia="Times New Roman" w:hAnsi="Times New Roman" w:cs="Times New Roman"/>
+          <w:kern w:val="0"/>
           <w14:ligatures w14:val="none"/>
         </w:rPr>
         <w:t>What percentage or number of hectares will be planted?</w:t>
@@ -406,15 +471,13 @@
         <w:rPr>
           <w:rFonts w:ascii="Times New Roman" w:eastAsia="Times New Roman" w:hAnsi="Times New Roman" w:cs="Times New Roman"/>
           <w:kern w:val="0"/>
-          <w:lang/>
-          <w14:ligatures w14:val="none"/>
-        </w:rPr>
-      </w:pPr>
-      <w:r>
-        <w:rPr>
-          <w:rFonts w:ascii="Times New Roman" w:eastAsia="Times New Roman" w:hAnsi="Times New Roman" w:cs="Times New Roman"/>
-          <w:kern w:val="0"/>
-          <w:lang/>
+          <w14:ligatures w14:val="none"/>
+        </w:rPr>
+      </w:pPr>
+      <w:r>
+        <w:rPr>
+          <w:rFonts w:ascii="Times New Roman" w:eastAsia="Times New Roman" w:hAnsi="Times New Roman" w:cs="Times New Roman"/>
+          <w:kern w:val="0"/>
           <w14:ligatures w14:val="none"/>
         </w:rPr>
         <w:t>All at once, a constant annual area, or a gradual increase in planting capacity?</w:t>
@@ -430,15 +493,13 @@
         <w:rPr>
           <w:rFonts w:ascii="Times New Roman" w:eastAsia="Times New Roman" w:hAnsi="Times New Roman" w:cs="Times New Roman"/>
           <w:kern w:val="0"/>
-          <w:lang/>
-          <w14:ligatures w14:val="none"/>
-        </w:rPr>
-      </w:pPr>
-      <w:r>
-        <w:rPr>
-          <w:rFonts w:ascii="Times New Roman" w:eastAsia="Times New Roman" w:hAnsi="Times New Roman" w:cs="Times New Roman"/>
-          <w:kern w:val="0"/>
-          <w:lang/>
+          <w14:ligatures w14:val="none"/>
+        </w:rPr>
+      </w:pPr>
+      <w:r>
+        <w:rPr>
+          <w:rFonts w:ascii="Times New Roman" w:eastAsia="Times New Roman" w:hAnsi="Times New Roman" w:cs="Times New Roman"/>
+          <w:kern w:val="0"/>
           <w14:ligatures w14:val="none"/>
         </w:rPr>
         <w:t>By which year must the target area be reached?</w:t>
@@ -450,7 +511,6 @@
         <w:rPr>
           <w:rFonts w:ascii="Times New Roman" w:eastAsia="Times New Roman" w:hAnsi="Times New Roman" w:cs="Times New Roman"/>
           <w:kern w:val="0"/>
-          <w:lang/>
           <w14:ligatures w14:val="none"/>
         </w:rPr>
       </w:pPr>
@@ -458,7 +518,6 @@
         <w:rPr>
           <w:rFonts w:ascii="Times New Roman" w:eastAsia="Times New Roman" w:hAnsi="Symbol" w:cs="Times New Roman"/>
           <w:kern w:val="0"/>
-          <w:lang/>
           <w14:ligatures w14:val="none"/>
         </w:rPr>
         <w:t></w:t>
@@ -467,7 +526,6 @@
         <w:rPr>
           <w:rFonts w:ascii="Times New Roman" w:eastAsia="Times New Roman" w:hAnsi="Times New Roman" w:cs="Times New Roman"/>
           <w:kern w:val="0"/>
-          <w:lang/>
           <w14:ligatures w14:val="none"/>
         </w:rPr>
         <w:t xml:space="preserve">  </w:t>
@@ -478,7 +536,6 @@
           <w:b/>
           <w:bCs/>
           <w:kern w:val="0"/>
-          <w:lang/>
           <w14:ligatures w14:val="none"/>
         </w:rPr>
         <w:t>Projection dates</w:t>
@@ -494,15 +551,13 @@
         <w:rPr>
           <w:rFonts w:ascii="Times New Roman" w:eastAsia="Times New Roman" w:hAnsi="Times New Roman" w:cs="Times New Roman"/>
           <w:kern w:val="0"/>
-          <w:lang/>
-          <w14:ligatures w14:val="none"/>
-        </w:rPr>
-      </w:pPr>
-      <w:r>
-        <w:rPr>
-          <w:rFonts w:ascii="Times New Roman" w:eastAsia="Times New Roman" w:hAnsi="Times New Roman" w:cs="Times New Roman"/>
-          <w:kern w:val="0"/>
-          <w:lang/>
+          <w14:ligatures w14:val="none"/>
+        </w:rPr>
+      </w:pPr>
+      <w:r>
+        <w:rPr>
+          <w:rFonts w:ascii="Times New Roman" w:eastAsia="Times New Roman" w:hAnsi="Times New Roman" w:cs="Times New Roman"/>
+          <w:kern w:val="0"/>
           <w14:ligatures w14:val="none"/>
         </w:rPr>
         <w:t>What is year zero, and which calendar year ends the 30-year programme?</w:t>
@@ -518,15 +573,13 @@
         <w:rPr>
           <w:rFonts w:ascii="Times New Roman" w:eastAsia="Times New Roman" w:hAnsi="Times New Roman" w:cs="Times New Roman"/>
           <w:kern w:val="0"/>
-          <w:lang/>
-          <w14:ligatures w14:val="none"/>
-        </w:rPr>
-      </w:pPr>
-      <w:r>
-        <w:rPr>
-          <w:rFonts w:ascii="Times New Roman" w:eastAsia="Times New Roman" w:hAnsi="Times New Roman" w:cs="Times New Roman"/>
-          <w:kern w:val="0"/>
-          <w:lang/>
+          <w14:ligatures w14:val="none"/>
+        </w:rPr>
+      </w:pPr>
+      <w:r>
+        <w:rPr>
+          <w:rFonts w:ascii="Times New Roman" w:eastAsia="Times New Roman" w:hAnsi="Times New Roman" w:cs="Times New Roman"/>
+          <w:kern w:val="0"/>
           <w14:ligatures w14:val="none"/>
         </w:rPr>
         <w:t>Include an additional 2050 result if useful?</w:t>
@@ -542,15 +595,13 @@
         <w:rPr>
           <w:rFonts w:ascii="Times New Roman" w:eastAsia="Times New Roman" w:hAnsi="Times New Roman" w:cs="Times New Roman"/>
           <w:kern w:val="0"/>
-          <w:lang/>
-          <w14:ligatures w14:val="none"/>
-        </w:rPr>
-      </w:pPr>
-      <w:r>
-        <w:rPr>
-          <w:rFonts w:ascii="Times New Roman" w:eastAsia="Times New Roman" w:hAnsi="Times New Roman" w:cs="Times New Roman"/>
-          <w:kern w:val="0"/>
-          <w:lang/>
+          <w14:ligatures w14:val="none"/>
+        </w:rPr>
+      </w:pPr>
+      <w:r>
+        <w:rPr>
+          <w:rFonts w:ascii="Times New Roman" w:eastAsia="Times New Roman" w:hAnsi="Times New Roman" w:cs="Times New Roman"/>
+          <w:kern w:val="0"/>
           <w14:ligatures w14:val="none"/>
         </w:rPr>
         <w:t>Specify whether planting occurs at the beginning or end of each year, so cohort ages are consistent.</w:t>
@@ -562,7 +613,6 @@
         <w:rPr>
           <w:rFonts w:ascii="Times New Roman" w:eastAsia="Times New Roman" w:hAnsi="Times New Roman" w:cs="Times New Roman"/>
           <w:kern w:val="0"/>
-          <w:lang/>
           <w14:ligatures w14:val="none"/>
         </w:rPr>
       </w:pPr>
@@ -570,16 +620,15 @@
         <w:rPr>
           <w:rFonts w:ascii="Times New Roman" w:eastAsia="Times New Roman" w:hAnsi="Symbol" w:cs="Times New Roman"/>
           <w:kern w:val="0"/>
-          <w:lang/>
-          <w14:ligatures w14:val="none"/>
-        </w:rPr>
+          <w14:ligatures w14:val="none"/>
+        </w:rPr>
+        <w:lastRenderedPageBreak/>
         <w:t></w:t>
       </w:r>
       <w:r>
         <w:rPr>
           <w:rFonts w:ascii="Times New Roman" w:eastAsia="Times New Roman" w:hAnsi="Times New Roman" w:cs="Times New Roman"/>
           <w:kern w:val="0"/>
-          <w:lang/>
           <w14:ligatures w14:val="none"/>
         </w:rPr>
         <w:t xml:space="preserve">  </w:t>
@@ -590,7 +639,6 @@
           <w:b/>
           <w:bCs/>
           <w:kern w:val="0"/>
-          <w:lang/>
           <w14:ligatures w14:val="none"/>
         </w:rPr>
         <w:t>Hybrid choices and tree-growth assumptions</w:t>
@@ -606,15 +654,13 @@
         <w:rPr>
           <w:rFonts w:ascii="Times New Roman" w:eastAsia="Times New Roman" w:hAnsi="Times New Roman" w:cs="Times New Roman"/>
           <w:kern w:val="0"/>
-          <w:lang/>
-          <w14:ligatures w14:val="none"/>
-        </w:rPr>
-      </w:pPr>
-      <w:r>
-        <w:rPr>
-          <w:rFonts w:ascii="Times New Roman" w:eastAsia="Times New Roman" w:hAnsi="Times New Roman" w:cs="Times New Roman"/>
-          <w:kern w:val="0"/>
-          <w:lang/>
+          <w14:ligatures w14:val="none"/>
+        </w:rPr>
+      </w:pPr>
+      <w:r>
+        <w:rPr>
+          <w:rFonts w:ascii="Times New Roman" w:eastAsia="Times New Roman" w:hAnsi="Times New Roman" w:cs="Times New Roman"/>
+          <w:kern w:val="0"/>
           <w14:ligatures w14:val="none"/>
         </w:rPr>
         <w:t>Compare Beaupre, Gibecq, Robusta and Trichobel separately, include a mixture, or both?</w:t>
@@ -630,15 +676,13 @@
         <w:rPr>
           <w:rFonts w:ascii="Times New Roman" w:eastAsia="Times New Roman" w:hAnsi="Times New Roman" w:cs="Times New Roman"/>
           <w:kern w:val="0"/>
-          <w:lang/>
-          <w14:ligatures w14:val="none"/>
-        </w:rPr>
-      </w:pPr>
-      <w:r>
-        <w:rPr>
-          <w:rFonts w:ascii="Times New Roman" w:eastAsia="Times New Roman" w:hAnsi="Times New Roman" w:cs="Times New Roman"/>
-          <w:kern w:val="0"/>
-          <w:lang/>
+          <w14:ligatures w14:val="none"/>
+        </w:rPr>
+      </w:pPr>
+      <w:r>
+        <w:rPr>
+          <w:rFonts w:ascii="Times New Roman" w:eastAsia="Times New Roman" w:hAnsi="Times New Roman" w:cs="Times New Roman"/>
+          <w:kern w:val="0"/>
           <w14:ligatures w14:val="none"/>
         </w:rPr>
         <w:t>For a mixture, what planting proportions?</w:t>
@@ -654,15 +698,13 @@
         <w:rPr>
           <w:rFonts w:ascii="Times New Roman" w:eastAsia="Times New Roman" w:hAnsi="Times New Roman" w:cs="Times New Roman"/>
           <w:kern w:val="0"/>
-          <w:lang/>
-          <w14:ligatures w14:val="none"/>
-        </w:rPr>
-      </w:pPr>
-      <w:r>
-        <w:rPr>
-          <w:rFonts w:ascii="Times New Roman" w:eastAsia="Times New Roman" w:hAnsi="Times New Roman" w:cs="Times New Roman"/>
-          <w:kern w:val="0"/>
-          <w:lang/>
+          <w14:ligatures w14:val="none"/>
+        </w:rPr>
+      </w:pPr>
+      <w:r>
+        <w:rPr>
+          <w:rFonts w:ascii="Times New Roman" w:eastAsia="Times New Roman" w:hAnsi="Times New Roman" w:cs="Times New Roman"/>
+          <w:kern w:val="0"/>
           <w14:ligatures w14:val="none"/>
         </w:rPr>
         <w:t xml:space="preserve">Which observed management history </w:t>
@@ -680,7 +722,6 @@
         <w:rPr>
           <w:rFonts w:ascii="Times New Roman" w:eastAsia="Times New Roman" w:hAnsi="Times New Roman" w:cs="Times New Roman"/>
           <w:kern w:val="0"/>
-          <w:lang/>
           <w14:ligatures w14:val="none"/>
         </w:rPr>
         <w:t>supplies the growth trajectory?</w:t>
@@ -701,7 +742,6 @@
         <w:rPr>
           <w:rFonts w:ascii="Times New Roman" w:eastAsia="Times New Roman" w:hAnsi="Times New Roman" w:cs="Times New Roman"/>
           <w:kern w:val="0"/>
-          <w:lang/>
           <w14:ligatures w14:val="none"/>
         </w:rPr>
       </w:pPr>
@@ -709,7 +749,6 @@
         <w:rPr>
           <w:rFonts w:ascii="Times New Roman" w:eastAsia="Times New Roman" w:hAnsi="Symbol" w:cs="Times New Roman"/>
           <w:kern w:val="0"/>
-          <w:lang/>
           <w14:ligatures w14:val="none"/>
         </w:rPr>
         <w:t></w:t>
@@ -718,7 +757,6 @@
         <w:rPr>
           <w:rFonts w:ascii="Times New Roman" w:eastAsia="Times New Roman" w:hAnsi="Times New Roman" w:cs="Times New Roman"/>
           <w:kern w:val="0"/>
-          <w:lang/>
           <w14:ligatures w14:val="none"/>
         </w:rPr>
         <w:t xml:space="preserve">  </w:t>
@@ -729,7 +767,6 @@
           <w:b/>
           <w:bCs/>
           <w:kern w:val="0"/>
-          <w:lang/>
           <w14:ligatures w14:val="none"/>
         </w:rPr>
         <w:t>How SOC develops through time</w:t>
@@ -745,15 +782,13 @@
         <w:rPr>
           <w:rFonts w:ascii="Times New Roman" w:eastAsia="Times New Roman" w:hAnsi="Times New Roman" w:cs="Times New Roman"/>
           <w:kern w:val="0"/>
-          <w:lang/>
-          <w14:ligatures w14:val="none"/>
-        </w:rPr>
-      </w:pPr>
-      <w:r>
-        <w:rPr>
-          <w:rFonts w:ascii="Times New Roman" w:eastAsia="Times New Roman" w:hAnsi="Times New Roman" w:cs="Times New Roman"/>
-          <w:kern w:val="0"/>
-          <w:lang/>
+          <w14:ligatures w14:val="none"/>
+        </w:rPr>
+      </w:pPr>
+      <w:r>
+        <w:rPr>
+          <w:rFonts w:ascii="Times New Roman" w:eastAsia="Times New Roman" w:hAnsi="Times New Roman" w:cs="Times New Roman"/>
+          <w:kern w:val="0"/>
           <w14:ligatures w14:val="none"/>
         </w:rPr>
         <w:t xml:space="preserve">Your supplied annualised rates are </w:t>
@@ -764,7 +799,6 @@
           <w:b/>
           <w:bCs/>
           <w:kern w:val="0"/>
-          <w:lang/>
           <w14:ligatures w14:val="none"/>
         </w:rPr>
         <w:t>0.866</w:t>
@@ -773,7 +807,6 @@
         <w:rPr>
           <w:rFonts w:ascii="Times New Roman" w:eastAsia="Times New Roman" w:hAnsi="Times New Roman" w:cs="Times New Roman"/>
           <w:kern w:val="0"/>
-          <w:lang/>
           <w14:ligatures w14:val="none"/>
         </w:rPr>
         <w:t xml:space="preserve"> for 19-year grassland, </w:t>
@@ -784,7 +817,6 @@
           <w:b/>
           <w:bCs/>
           <w:kern w:val="0"/>
-          <w:lang/>
           <w14:ligatures w14:val="none"/>
         </w:rPr>
         <w:t>0.408</w:t>
@@ -793,7 +825,6 @@
         <w:rPr>
           <w:rFonts w:ascii="Times New Roman" w:eastAsia="Times New Roman" w:hAnsi="Times New Roman" w:cs="Times New Roman"/>
           <w:kern w:val="0"/>
-          <w:lang/>
           <w14:ligatures w14:val="none"/>
         </w:rPr>
         <w:t xml:space="preserve"> for 32-year grassland, and </w:t>
@@ -804,7 +835,6 @@
           <w:b/>
           <w:bCs/>
           <w:kern w:val="0"/>
-          <w:lang/>
           <w14:ligatures w14:val="none"/>
         </w:rPr>
         <w:t>0.658 Mg C ha⁻¹ yr⁻¹</w:t>
@@ -813,7 +843,6 @@
         <w:rPr>
           <w:rFonts w:ascii="Times New Roman" w:eastAsia="Times New Roman" w:hAnsi="Times New Roman" w:cs="Times New Roman"/>
           <w:kern w:val="0"/>
-          <w:lang/>
           <w14:ligatures w14:val="none"/>
         </w:rPr>
         <w:t xml:space="preserve"> for 32-year tree rows.</w:t>
@@ -829,15 +858,13 @@
         <w:rPr>
           <w:rFonts w:ascii="Times New Roman" w:eastAsia="Times New Roman" w:hAnsi="Times New Roman" w:cs="Times New Roman"/>
           <w:kern w:val="0"/>
-          <w:lang/>
-          <w14:ligatures w14:val="none"/>
-        </w:rPr>
-      </w:pPr>
-      <w:r>
-        <w:rPr>
-          <w:rFonts w:ascii="Times New Roman" w:eastAsia="Times New Roman" w:hAnsi="Times New Roman" w:cs="Times New Roman"/>
-          <w:kern w:val="0"/>
-          <w:lang/>
+          <w14:ligatures w14:val="none"/>
+        </w:rPr>
+      </w:pPr>
+      <w:r>
+        <w:rPr>
+          <w:rFonts w:ascii="Times New Roman" w:eastAsia="Times New Roman" w:hAnsi="Times New Roman" w:cs="Times New Roman"/>
+          <w:kern w:val="0"/>
           <w14:ligatures w14:val="none"/>
         </w:rPr>
         <w:t>construct a trajectory constrained by the observed stock excesses at those ages</w:t>
@@ -862,15 +889,13 @@
         <w:rPr>
           <w:rFonts w:ascii="Times New Roman" w:eastAsia="Times New Roman" w:hAnsi="Times New Roman" w:cs="Times New Roman"/>
           <w:kern w:val="0"/>
-          <w:lang/>
-          <w14:ligatures w14:val="none"/>
-        </w:rPr>
-      </w:pPr>
-      <w:r>
-        <w:rPr>
-          <w:rFonts w:ascii="Times New Roman" w:eastAsia="Times New Roman" w:hAnsi="Times New Roman" w:cs="Times New Roman"/>
-          <w:kern w:val="0"/>
-          <w:lang/>
+          <w14:ligatures w14:val="none"/>
+        </w:rPr>
+      </w:pPr>
+      <w:r>
+        <w:rPr>
+          <w:rFonts w:ascii="Times New Roman" w:eastAsia="Times New Roman" w:hAnsi="Times New Roman" w:cs="Times New Roman"/>
+          <w:kern w:val="0"/>
           <w14:ligatures w14:val="none"/>
         </w:rPr>
         <w:t>Weight tree-row and grassland contributions by their respective area fractions.</w:t>
@@ -882,7 +907,6 @@
         <w:rPr>
           <w:rFonts w:ascii="Times New Roman" w:eastAsia="Times New Roman" w:hAnsi="Times New Roman" w:cs="Times New Roman"/>
           <w:kern w:val="0"/>
-          <w:lang/>
           <w14:ligatures w14:val="none"/>
         </w:rPr>
       </w:pPr>
@@ -890,7 +914,6 @@
         <w:rPr>
           <w:rFonts w:ascii="Times New Roman" w:eastAsia="Times New Roman" w:hAnsi="Symbol" w:cs="Times New Roman"/>
           <w:kern w:val="0"/>
-          <w:lang/>
           <w14:ligatures w14:val="none"/>
         </w:rPr>
         <w:t></w:t>
@@ -899,7 +922,6 @@
         <w:rPr>
           <w:rFonts w:ascii="Times New Roman" w:eastAsia="Times New Roman" w:hAnsi="Times New Roman" w:cs="Times New Roman"/>
           <w:kern w:val="0"/>
-          <w:lang/>
           <w14:ligatures w14:val="none"/>
         </w:rPr>
         <w:t xml:space="preserve">  </w:t>
@@ -910,7 +932,6 @@
           <w:b/>
           <w:bCs/>
           <w:kern w:val="0"/>
-          <w:lang/>
           <w14:ligatures w14:val="none"/>
         </w:rPr>
         <w:t>Belowground biomass</w:t>
@@ -926,18 +947,15 @@
         <w:rPr>
           <w:rFonts w:ascii="Times New Roman" w:eastAsia="Times New Roman" w:hAnsi="Times New Roman" w:cs="Times New Roman"/>
           <w:kern w:val="0"/>
-          <w:lang/>
-          <w14:ligatures w14:val="none"/>
-        </w:rPr>
-      </w:pPr>
-      <w:r>
-        <w:rPr>
-          <w:rFonts w:ascii="Times New Roman" w:eastAsia="Times New Roman" w:hAnsi="Times New Roman" w:cs="Times New Roman"/>
-          <w:kern w:val="0"/>
-          <w:lang/>
-          <w14:ligatures w14:val="none"/>
-        </w:rPr>
-        <w:lastRenderedPageBreak/>
+          <w14:ligatures w14:val="none"/>
+        </w:rPr>
+      </w:pPr>
+      <w:r>
+        <w:rPr>
+          <w:rFonts w:ascii="Times New Roman" w:eastAsia="Times New Roman" w:hAnsi="Times New Roman" w:cs="Times New Roman"/>
+          <w:kern w:val="0"/>
+          <w14:ligatures w14:val="none"/>
+        </w:rPr>
         <w:t xml:space="preserve">Confirm </w:t>
       </w:r>
       <w:r>
@@ -946,7 +964,6 @@
           <w:b/>
           <w:bCs/>
           <w:kern w:val="0"/>
-          <w:lang/>
           <w14:ligatures w14:val="none"/>
         </w:rPr>
         <w:t>BGB C = 0.26 × AGB C at each age</w:t>
@@ -955,7 +972,6 @@
         <w:rPr>
           <w:rFonts w:ascii="Times New Roman" w:eastAsia="Times New Roman" w:hAnsi="Times New Roman" w:cs="Times New Roman"/>
           <w:kern w:val="0"/>
-          <w:lang/>
           <w14:ligatures w14:val="none"/>
         </w:rPr>
         <w:t xml:space="preserve"> as the central assumption.</w:t>
@@ -973,7 +989,6 @@
         <w:rPr>
           <w:rFonts w:ascii="Times New Roman" w:eastAsia="Times New Roman" w:hAnsi="Times New Roman" w:cs="Times New Roman"/>
           <w:kern w:val="0"/>
-          <w:lang/>
           <w14:ligatures w14:val="none"/>
         </w:rPr>
         <w:t>Include 0.20 and 0.40 as sensitivity cases?</w:t>
@@ -1004,15 +1019,13 @@
         <w:rPr>
           <w:rFonts w:ascii="Times New Roman" w:eastAsia="Times New Roman" w:hAnsi="Times New Roman" w:cs="Times New Roman"/>
           <w:kern w:val="0"/>
-          <w:lang/>
-          <w14:ligatures w14:val="none"/>
-        </w:rPr>
-      </w:pPr>
-      <w:r>
-        <w:rPr>
-          <w:rFonts w:ascii="Times New Roman" w:eastAsia="Times New Roman" w:hAnsi="Times New Roman" w:cs="Times New Roman"/>
-          <w:kern w:val="0"/>
-          <w:lang/>
+          <w14:ligatures w14:val="none"/>
+        </w:rPr>
+      </w:pPr>
+      <w:r>
+        <w:rPr>
+          <w:rFonts w:ascii="Times New Roman" w:eastAsia="Times New Roman" w:hAnsi="Times New Roman" w:cs="Times New Roman"/>
+          <w:kern w:val="0"/>
           <w14:ligatures w14:val="none"/>
         </w:rPr>
         <w:t xml:space="preserve">Retain 50% carbon content for both </w:t>
@@ -1030,7 +1043,6 @@
         <w:rPr>
           <w:rFonts w:ascii="Times New Roman" w:eastAsia="Times New Roman" w:hAnsi="Times New Roman" w:cs="Times New Roman"/>
           <w:kern w:val="0"/>
-          <w:lang/>
           <w14:ligatures w14:val="none"/>
         </w:rPr>
         <w:t xml:space="preserve"> pools.</w:t>
@@ -1042,7 +1054,6 @@
         <w:rPr>
           <w:rFonts w:ascii="Times New Roman" w:eastAsia="Times New Roman" w:hAnsi="Times New Roman" w:cs="Times New Roman"/>
           <w:kern w:val="0"/>
-          <w:lang/>
           <w14:ligatures w14:val="none"/>
         </w:rPr>
       </w:pPr>
@@ -1050,7 +1061,6 @@
         <w:rPr>
           <w:rFonts w:ascii="Times New Roman" w:eastAsia="Times New Roman" w:hAnsi="Symbol" w:cs="Times New Roman"/>
           <w:kern w:val="0"/>
-          <w:lang/>
           <w14:ligatures w14:val="none"/>
         </w:rPr>
         <w:t></w:t>
@@ -1059,7 +1069,6 @@
         <w:rPr>
           <w:rFonts w:ascii="Times New Roman" w:eastAsia="Times New Roman" w:hAnsi="Times New Roman" w:cs="Times New Roman"/>
           <w:kern w:val="0"/>
-          <w:lang/>
           <w14:ligatures w14:val="none"/>
         </w:rPr>
         <w:t xml:space="preserve">  </w:t>
@@ -1070,7 +1079,6 @@
           <w:b/>
           <w:bCs/>
           <w:kern w:val="0"/>
-          <w:lang/>
           <w14:ligatures w14:val="none"/>
         </w:rPr>
         <w:t>Headline outputs and net-zero comparison</w:t>
@@ -1086,15 +1094,13 @@
         <w:rPr>
           <w:rFonts w:ascii="Times New Roman" w:eastAsia="Times New Roman" w:hAnsi="Times New Roman" w:cs="Times New Roman"/>
           <w:kern w:val="0"/>
-          <w:lang/>
-          <w14:ligatures w14:val="none"/>
-        </w:rPr>
-      </w:pPr>
-      <w:r>
-        <w:rPr>
-          <w:rFonts w:ascii="Times New Roman" w:eastAsia="Times New Roman" w:hAnsi="Times New Roman" w:cs="Times New Roman"/>
-          <w:kern w:val="0"/>
-          <w:lang/>
+          <w14:ligatures w14:val="none"/>
+        </w:rPr>
+      </w:pPr>
+      <w:r>
+        <w:rPr>
+          <w:rFonts w:ascii="Times New Roman" w:eastAsia="Times New Roman" w:hAnsi="Times New Roman" w:cs="Times New Roman"/>
+          <w:kern w:val="0"/>
           <w14:ligatures w14:val="none"/>
         </w:rPr>
         <w:t>Annual additional accumulation, cumulative additional carbon stock, and both expressed as CO₂.</w:t>
@@ -1110,15 +1116,13 @@
         <w:rPr>
           <w:rFonts w:ascii="Times New Roman" w:eastAsia="Times New Roman" w:hAnsi="Times New Roman" w:cs="Times New Roman"/>
           <w:kern w:val="0"/>
-          <w:lang/>
-          <w14:ligatures w14:val="none"/>
-        </w:rPr>
-      </w:pPr>
-      <w:r>
-        <w:rPr>
-          <w:rFonts w:ascii="Times New Roman" w:eastAsia="Times New Roman" w:hAnsi="Times New Roman" w:cs="Times New Roman"/>
-          <w:kern w:val="0"/>
-          <w:lang/>
+          <w14:ligatures w14:val="none"/>
+        </w:rPr>
+      </w:pPr>
+      <w:r>
+        <w:rPr>
+          <w:rFonts w:ascii="Times New Roman" w:eastAsia="Times New Roman" w:hAnsi="Times New Roman" w:cs="Times New Roman"/>
+          <w:kern w:val="0"/>
           <w14:ligatures w14:val="none"/>
         </w:rPr>
         <w:t xml:space="preserve">Show AGB separately and the combined estimate with </w:t>
@@ -1136,7 +1140,6 @@
         <w:rPr>
           <w:rFonts w:ascii="Times New Roman" w:eastAsia="Times New Roman" w:hAnsi="Times New Roman" w:cs="Times New Roman"/>
           <w:kern w:val="0"/>
-          <w:lang/>
           <w14:ligatures w14:val="none"/>
         </w:rPr>
         <w:t>components.</w:t>
@@ -1152,15 +1155,13 @@
         <w:rPr>
           <w:rFonts w:ascii="Times New Roman" w:eastAsia="Times New Roman" w:hAnsi="Times New Roman" w:cs="Times New Roman"/>
           <w:kern w:val="0"/>
-          <w:lang/>
-          <w14:ligatures w14:val="none"/>
-        </w:rPr>
-      </w:pPr>
-      <w:r>
-        <w:rPr>
-          <w:rFonts w:ascii="Times New Roman" w:eastAsia="Times New Roman" w:hAnsi="Times New Roman" w:cs="Times New Roman"/>
-          <w:kern w:val="0"/>
-          <w:lang/>
+          <w14:ligatures w14:val="none"/>
+        </w:rPr>
+      </w:pPr>
+      <w:r>
+        <w:rPr>
+          <w:rFonts w:ascii="Times New Roman" w:eastAsia="Times New Roman" w:hAnsi="Times New Roman" w:cs="Times New Roman"/>
+          <w:kern w:val="0"/>
           <w14:ligatures w14:val="none"/>
         </w:rPr>
         <w:t xml:space="preserve">If expressing a contribution to net zero, </w:t>
@@ -1178,7 +1179,6 @@
         <w:rPr>
           <w:rFonts w:ascii="Times New Roman" w:eastAsia="Times New Roman" w:hAnsi="Times New Roman" w:cs="Times New Roman"/>
           <w:kern w:val="0"/>
-          <w:lang/>
           <w14:ligatures w14:val="none"/>
         </w:rPr>
         <w:t>choose the emissions benchmark: national emissions, agricultural emissions, or a future residual-emissions pathway. Compare annual removal with annual emissions.</w:t>
@@ -1190,7 +1190,6 @@
         <w:rPr>
           <w:rFonts w:ascii="Times New Roman" w:eastAsia="Times New Roman" w:hAnsi="Times New Roman" w:cs="Times New Roman"/>
           <w:kern w:val="0"/>
-          <w:lang/>
           <w14:ligatures w14:val="none"/>
         </w:rPr>
       </w:pPr>
@@ -1198,7 +1197,6 @@
         <w:rPr>
           <w:rFonts w:ascii="Times New Roman" w:eastAsia="Times New Roman" w:hAnsi="Symbol" w:cs="Times New Roman"/>
           <w:kern w:val="0"/>
-          <w:lang/>
           <w14:ligatures w14:val="none"/>
         </w:rPr>
         <w:t></w:t>
@@ -1207,7 +1205,6 @@
         <w:rPr>
           <w:rFonts w:ascii="Times New Roman" w:eastAsia="Times New Roman" w:hAnsi="Times New Roman" w:cs="Times New Roman"/>
           <w:kern w:val="0"/>
-          <w:lang/>
           <w14:ligatures w14:val="none"/>
         </w:rPr>
         <w:t xml:space="preserve">  </w:t>
@@ -1218,7 +1215,6 @@
           <w:b/>
           <w:bCs/>
           <w:kern w:val="0"/>
-          <w:lang/>
           <w14:ligatures w14:val="none"/>
         </w:rPr>
         <w:t>Which comparisons belong in the paper</w:t>
@@ -1234,15 +1230,13 @@
         <w:rPr>
           <w:rFonts w:ascii="Times New Roman" w:eastAsia="Times New Roman" w:hAnsi="Times New Roman" w:cs="Times New Roman"/>
           <w:kern w:val="0"/>
-          <w:lang/>
-          <w14:ligatures w14:val="none"/>
-        </w:rPr>
-      </w:pPr>
-      <w:r>
-        <w:rPr>
-          <w:rFonts w:ascii="Times New Roman" w:eastAsia="Times New Roman" w:hAnsi="Times New Roman" w:cs="Times New Roman"/>
-          <w:kern w:val="0"/>
-          <w:lang/>
+          <w14:ligatures w14:val="none"/>
+        </w:rPr>
+      </w:pPr>
+      <w:r>
+        <w:rPr>
+          <w:rFonts w:ascii="Times New Roman" w:eastAsia="Times New Roman" w:hAnsi="Times New Roman" w:cs="Times New Roman"/>
+          <w:kern w:val="0"/>
           <w14:ligatures w14:val="none"/>
         </w:rPr>
         <w:t>Choose a small set of headline scenarios with a clear purpose—for example, different adoption ambitions.</w:t>
@@ -1258,15 +1252,13 @@
         <w:rPr>
           <w:rFonts w:ascii="Times New Roman" w:eastAsia="Times New Roman" w:hAnsi="Times New Roman" w:cs="Times New Roman"/>
           <w:kern w:val="0"/>
-          <w:lang/>
-          <w14:ligatures w14:val="none"/>
-        </w:rPr>
-      </w:pPr>
-      <w:r>
-        <w:rPr>
-          <w:rFonts w:ascii="Times New Roman" w:eastAsia="Times New Roman" w:hAnsi="Times New Roman" w:cs="Times New Roman"/>
-          <w:kern w:val="0"/>
-          <w:lang/>
+          <w14:ligatures w14:val="none"/>
+        </w:rPr>
+      </w:pPr>
+      <w:r>
+        <w:rPr>
+          <w:rFonts w:ascii="Times New Roman" w:eastAsia="Times New Roman" w:hAnsi="Times New Roman" w:cs="Times New Roman"/>
+          <w:kern w:val="0"/>
           <w14:ligatures w14:val="none"/>
         </w:rPr>
         <w:t>Treat hybrid, planting layout, SOC assumptions and root allocation as structured comparisons or sensitivities.</w:t>
@@ -1282,15 +1274,13 @@
         <w:rPr>
           <w:rFonts w:ascii="Times New Roman" w:eastAsia="Times New Roman" w:hAnsi="Times New Roman" w:cs="Times New Roman"/>
           <w:kern w:val="0"/>
-          <w:lang/>
-          <w14:ligatures w14:val="none"/>
-        </w:rPr>
-      </w:pPr>
-      <w:r>
-        <w:rPr>
-          <w:rFonts w:ascii="Times New Roman" w:eastAsia="Times New Roman" w:hAnsi="Times New Roman" w:cs="Times New Roman"/>
-          <w:kern w:val="0"/>
-          <w:lang/>
+          <w14:ligatures w14:val="none"/>
+        </w:rPr>
+      </w:pPr>
+      <w:r>
+        <w:rPr>
+          <w:rFonts w:ascii="Times New Roman" w:eastAsia="Times New Roman" w:hAnsi="Times New Roman" w:cs="Times New Roman"/>
+          <w:kern w:val="0"/>
           <w14:ligatures w14:val="none"/>
         </w:rPr>
         <w:t>Decide which uncertainties receive numerical ranges and which remain discussion limitations.</w:t>
@@ -4955,6 +4945,7 @@
   <w:style w:type="character" w:default="1" w:styleId="DefaultParagraphFont">
     <w:name w:val="Default Paragraph Font"/>
     <w:uiPriority w:val="1"/>
+    <w:semiHidden/>
     <w:unhideWhenUsed/>
   </w:style>
   <w:style w:type="table" w:default="1" w:styleId="TableNormal">

</xml_diff>